<commit_message>
feat(demo): expand samples with compatibility examples
Add DOCX font inheritance, PPTX numbering and preset shape pages, and XLSX palette and tint comparisons to the existing generated samples. Preserve the original content and document where to find each example.

Tested: 14 focused Rust tests, workspace all-target Clippy, rustfmt, deterministic sample generation, packaged asset equality, on-device demo sample navigation and XLSX checks, independent source and visual review
</commit_message>
<xml_diff>
--- a/demo/src/main/assets/samples/sample.docx
+++ b/demo/src/main/assets/samples/sample.docx
@@ -376,6 +376,81 @@
         <w:t>较短的第二行。</w:t>
       </w:r>
     </w:p>
+    <w:p>
+      <w:pPr>
+        <w:pStyle w:val="BaseTitle"/>
+      </w:pPr>
+      <w:r>
+        <w:t>07 字体与继承</w:t>
+      </w:r>
+    </w:p>
+    <w:p>
+      <w:pPr>
+        <w:spacing w:after="120"/>
+      </w:pPr>
+      <w:r>
+        <w:t>前两例为等宽字体；第三例为衬线粗斜体；第四例覆盖为等宽并保留粗斜体。缺失字体由设备替换，中文字形也可能回退。</w:t>
+      </w:r>
+    </w:p>
+    <w:p>
+      <w:pPr>
+        <w:pStyle w:val="Normal"/>
+        <w:spacing w:after="120"/>
+      </w:pPr>
+      <w:r>
+        <w:rPr>
+          <w:rFonts w:ascii="monospace" w:hAnsi="monospace" w:eastAsia="monospace" w:cs="monospace"/>
+        </w:rPr>
+        <w:t>直接指定等宽：iiii WWWW 0123456789 中文</w:t>
+      </w:r>
+    </w:p>
+    <w:p>
+      <w:pPr>
+        <w:pStyle w:val="ShowcaseMono"/>
+        <w:spacing w:after="120"/>
+      </w:pPr>
+      <w:r>
+        <w:rPr/>
+        <w:t>段落样式继承：iiii WWWW 0123456789 中文</w:t>
+      </w:r>
+    </w:p>
+    <w:p>
+      <w:pPr>
+        <w:pStyle w:val="ShowcaseMono"/>
+        <w:spacing w:after="120"/>
+      </w:pPr>
+      <w:r>
+        <w:rPr>
+          <w:rStyle w:val="ShowcaseSerif"/>
+        </w:rPr>
+        <w:t>字符样式继承：iiii WWWW 0123456789 中文</w:t>
+      </w:r>
+    </w:p>
+    <w:p>
+      <w:pPr>
+        <w:pStyle w:val="ShowcaseMono"/>
+        <w:spacing w:after="120"/>
+      </w:pPr>
+      <w:r>
+        <w:rPr>
+          <w:rStyle w:val="ShowcaseSerif"/>
+          <w:rFonts w:ascii="monospace" w:hAnsi="monospace" w:eastAsia="monospace" w:cs="monospace"/>
+        </w:rPr>
+        <w:t>直接覆盖字体：iiii WWWW 0123456789 中文</w:t>
+      </w:r>
+    </w:p>
+    <w:p>
+      <w:pPr>
+        <w:pStyle w:val="ShowcaseMono"/>
+        <w:spacing w:after="120"/>
+      </w:pPr>
+      <w:r>
+        <w:rPr>
+          <w:rFonts w:ascii="Unavailable Office Font" w:hAnsi="Unavailable Office Font" w:eastAsia="Unavailable Office Font" w:cs="Unavailable Office Font"/>
+        </w:rPr>
+        <w:t>缺失字体回退：iiii WWWW 0123456789 中文</w:t>
+      </w:r>
+    </w:p>
     <w:sectPr>
       <w:headerReference w:type="default" r:id="rHeader"/>
       <w:pgSz w:w="12240" w:h="15840"/>
@@ -427,5 +502,24 @@
       <w:jc w:val="center"/>
     </w:pPr>
   </w:style>
+  <w:style w:type="paragraph" w:styleId="ShowcaseMonoBase">
+    <w:basedOn w:val="Normal"/>
+    <w:rPr>
+      <w:rFonts w:ascii="monospace" w:hAnsi="monospace" w:eastAsia="monospace" w:cs="monospace"/>
+    </w:rPr>
+  </w:style>
+  <w:style w:type="paragraph" w:styleId="ShowcaseMono">
+    <w:basedOn w:val="ShowcaseMonoBase"/>
+  </w:style>
+  <w:style w:type="character" w:styleId="ShowcaseSerifBase">
+    <w:rPr>
+      <w:rFonts w:ascii="serif" w:hAnsi="serif" w:eastAsia="serif" w:cs="serif"/>
+      <w:b/>
+      <w:i/>
+    </w:rPr>
+  </w:style>
+  <w:style w:type="character" w:styleId="ShowcaseSerif">
+    <w:basedOn w:val="ShowcaseSerifBase"/>
+  </w:style>
 </w:styles>
 </file>
</xml_diff>